<commit_message>
Moving from AQL 7.x to AQL 8.x.
</commit_message>
<xml_diff>
--- a/tests/org.obeonetwork.m2doc.tests/resources/template/invalidParameterType/invalidParameterType-expected-validation.docx
+++ b/tests/org.obeonetwork.m2doc.tests/resources/template/invalidParameterType/invalidParameterType-expected-validation.docx
@@ -126,9 +126,6 @@
         <w:t xml:space="preserve">    </w:t>
       </w:r>
       <w:r>
-        <w:t xml:space="preserve">    </w:t>
-      </w:r>
-      <w:r>
         <w:rPr>
           <w:color w:val="FF0000"/>
           <w:sz w:val="32"/>
@@ -155,25 +152,6 @@
           <w:lang w:val="en-US"/>
         </w:rPr>
         <w:fldChar w:fldCharType="end"/>
-      </w:r>
-      <w:r>
-        <w:t xml:space="preserve">    </w:t>
-      </w:r>
-      <w:r>
-        <w:rPr>
-          <w:color w:val="FF0000"/>
-          <w:sz w:val="32"/>
-          <w:highlight w:val="lightGray"/>
-        </w:rPr>
-        <w:t>&lt;---</w:t>
-      </w:r>
-      <w:r>
-        <w:rPr>
-          <w:color w:val="FF0000"/>
-          <w:sz w:val="32"/>
-          <w:highlight w:val="lightGray"/>
-        </w:rPr>
-        <w:t>Expression "a" is invalid: invalid type literal notExisting::Invalid</w:t>
       </w:r>
     </w:p>
     <w:p>

</xml_diff>